<commit_message>
Update course report: reflect Streamlit migration, HK data fix, and perf optimizations
- Replace all Gradio references with Streamlit (framework, port 8501, docs)
- Document the HK financial API switch (stock_financial_hk_analysis_indicator_em)
- Add performance optimization details: streaming LLM, parallel chart rendering,
  prompt size reduction
- Update test results with latest 10-indicator HK data and 9-year history
- Add new bug fix entries: HK financial data missing, total shares/market cap,
  report generation latency
</commit_message>
<xml_diff>
--- a/AI智能投研助手_实践报告.docx
+++ b/AI智能投研助手_实践报告.docx
@@ -274,7 +274,7 @@
           <w:rFonts w:ascii="宋体" w:hAnsi="宋体"/>
           <w:sz w:val="24"/>
         </w:rPr>
-        <w:t>在线访问地址：http://&lt;ECS公网IP&gt;:7860</w:t>
+        <w:t>在线访问地址：http://&lt;ECS公网IP&gt;:8501</w:t>
       </w:r>
     </w:p>
     <w:p>
@@ -352,7 +352,7 @@
           <w:rFonts w:ascii="宋体" w:hAnsi="宋体"/>
           <w:sz w:val="24"/>
         </w:rPr>
-        <w:t>• API配置灵活性：支持OpenAI兼容接口，用户可自定义Base URL、Model和API Key，适配各种大语言模型服务。</w:t>
+        <w:t>• API配置灵活性：支持OpenAI兼容接口，用户可自定义Base URL、Model和API Key，适配DeepSeek等各种大语言模型服务。</w:t>
       </w:r>
     </w:p>
     <w:p>
@@ -407,7 +407,7 @@
           <w:rFonts w:ascii="宋体" w:hAnsi="宋体"/>
           <w:sz w:val="24"/>
         </w:rPr>
-        <w:t>（1）展示层（Presentation Layer）：基于Gradio框架构建Web用户界面，负责用户交互、输入接收和结果展示。Gradio自动处理前后端通信，提供现代化的UI组件，并支持Plotly图表直接嵌入。</w:t>
+        <w:t>（1）展示层（Presentation Layer）：基于Streamlit框架构建Web用户界面，负责用户交互、输入接收和结果展示。Streamlit提供丰富的组件生态，支持Plotly图表直接嵌入，并通过CSS自定义实现现代化主题。</w:t>
       </w:r>
     </w:p>
     <w:p>
@@ -484,7 +484,7 @@
           <w:rFonts w:ascii="宋体" w:hAnsi="宋体"/>
           <w:sz w:val="24"/>
         </w:rPr>
-        <w:t>本项目基于OpenAI兼容接口调用大语言模型，默认使用DeepSeek模型。在llm_client.py中封装了标准的Chat Completion调用，支持流式输出（streaming），使得报告可以逐段展示，提升用户体验。提示词工程方面，通过prompts.py设计了专业的金融分析师角色提示词，引导模型按照特定的报告结构（公司概况、财务分析、估值分析、风险提示）进行输出。</w:t>
+        <w:t>本项目基于OpenAI兼容接口调用大语言模型，默认使用DeepSeek模型。在llm_client.py中封装了标准的Chat Completion调用和流式输出（chat_stream）两种模式。流式模式下设置stream=True，通过生成器逐块yield响应内容，Streamlit前端使用st.empty()占位符增量更新，实现报告的实时逐字展示，大幅缩短用户感知等待时间。提示词工程方面，通过prompts.py设计了专业的金融分析师角色提示词，引导模型按照特定的报告结构（公司概况、财务分析、SWOT分析、估值判断、投资建议）进行输出。</w:t>
       </w:r>
     </w:p>
     <w:p>
@@ -510,7 +510,7 @@
           <w:rFonts w:ascii="宋体" w:hAnsi="宋体"/>
           <w:sz w:val="24"/>
         </w:rPr>
-        <w:t>AKShare是一个开源的Python金融数据接口库。系统通过AKShare获取三类数据：实时行情（stock_zh_a_spot / stock_hk_spot_em），获取股票的当前价格、涨跌幅、成交量等；财务报表（stock_financial_abstract / stock_hk_financial_indicator_em），获取季度营收、净利润、ROE、毛利率、净利率等核心财务指标；历史价格（stock_zh_a_hist_tx / stock_hk_hist），获取复权后的日线价格序列用于趋势图绘制。对于港股，额外通过stock_hk_company_profile_em获取行业分类和公司概况信息。系统实现了带TTL的缓存机制，避免频繁请求API导致被限制。</w:t>
+        <w:t>AKShare是一个开源的Python金融数据接口库。系统通过AKShare获取三类数据：实时行情（stock_zh_a_spot / stock_hk_spot_em），获取股票的当前价格、涨跌幅、成交量等；财务报表（A股使用stock_financial_abstract，港股使用stock_financial_hk_analysis_indicator_em），获取多年营收、净利润、ROE、毛利率、净利率、资产负债率、每股经营现金流等10项核心财务指标；历史价格（stock_zh_a_hist_tx / stock_hk_hist），获取复权后的日线价格序列用于趋势图绘制。对于港股，额外通过stock_hk_company_profile_em获取行业分类和公司概况信息，并通过stock_hk_financial_indicator_em获取总股本用于市值计算。系统实现了带TTL（300秒）的全市场缓存和单股缓存机制，并支持启动时后台预热。数据获取采用ThreadPoolExecutor并行执行，行情、财务、价格三类数据同时请求，互不阻塞。</w:t>
       </w:r>
     </w:p>
     <w:p>
@@ -536,7 +536,7 @@
           <w:rFonts w:ascii="宋体" w:hAnsi="宋体"/>
           <w:sz w:val="24"/>
         </w:rPr>
-        <w:t>可视化模块（visualizer.py）使用Plotly创建四种交互式图表：营收利润趋势图使用双Y轴设计，柱状图展示营收，折线图展示净利润；盈利能力趋势图展示ROE、毛利率、净利率三条指标曲线的变化趋势；估值仪表盘使用Indicator组件展示当前市盈率（PE），并标注市净率（PB）和股价；历史价格走势图展示前复权收盘价曲线和20日均线，帮助识别技术趋势。所有图表统一使用professional配色方案和布局样式。</w:t>
+        <w:t>可视化模块（visualizer.py）使用Plotly创建四种交互式图表：营收利润趋势图使用双Y轴设计，柱状图展示营收，折线图展示净利润；盈利能力趋势图展示ROE、毛利率、净利率三条指标曲线的变化趋势；估值仪表盘使用Gauge组件展示当前市盈率（PE），并标注市净率（PB）和最新股价；历史价格走势图展示前复权收盘价曲线和20日均线，帮助识别技术趋势。图表生成与LLM报告生成通过ThreadPoolExecutor并行执行，四张图表在后台线程中同时渲染，不阻塞AI报告流的展示。</w:t>
       </w:r>
     </w:p>
     <w:p>
@@ -549,7 +549,7 @@
           <w:rFonts w:ascii="宋体" w:hAnsi="宋体"/>
           <w:sz w:val="24"/>
         </w:rPr>
-        <w:t>（4）智能市场识别</w:t>
+        <w:t>（4）智能市场识别与性能优化</w:t>
       </w:r>
     </w:p>
     <w:p>
@@ -562,7 +562,7 @@
           <w:rFonts w:ascii="宋体" w:hAnsi="宋体"/>
           <w:sz w:val="24"/>
         </w:rPr>
-        <w:t>系统通过代码长度自动判断市场类型：6位数字为A股代码，5位数字为港股代码。对于A股，根据代码前缀自动加上交易所标识（sh/sz）。对于港股代码，自动补齐前导零至5位。搜索功能支持代码精确匹配和名称模糊匹配两种模式。</w:t>
+        <w:t>系统通过代码长度自动判断市场类型：6位数字为A股代码，5位数字为港股代码。对于A股，根据代码前缀自动加上交易所标识（sh/sz）。对于港股代码，自动补齐前导零至5位。搜索功能支持代码精确匹配和名称模糊匹配两种模式。性能方面，实现了三项关键优化：LLM流式输出（stream=True），用户实时看到AI撰写进度；图表与LLM并行生成（ThreadPoolExecutor，4线程），消除串行等待；Prompt瘦身（财务历史从3季缩减至1季），减少输入token降低首字延迟。</w:t>
       </w:r>
     </w:p>
     <w:p>
@@ -659,8 +659,15 @@
             <w:tcW w:type="dxa" w:w="4323"/>
           </w:tcPr>
           <w:p>
+            <w:pPr>
+              <w:spacing w:line="300" w:lineRule="auto"/>
+            </w:pPr>
             <w:r>
-              <w:t>Streamlit 1.32+</w:t>
+              <w:rPr>
+                <w:rFonts w:ascii="宋体" w:hAnsi="宋体"/>
+                <w:sz w:val="24"/>
+              </w:rPr>
+              <w:t>Streamlit（用于构建数据驱动的AI应用界面）</w:t>
             </w:r>
           </w:p>
         </w:tc>
@@ -760,8 +767,15 @@
             <w:tcW w:type="dxa" w:w="4323"/>
           </w:tcPr>
           <w:p>
+            <w:pPr>
+              <w:spacing w:line="300" w:lineRule="auto"/>
+            </w:pPr>
             <w:r>
-              <w:t>Plotly 5.x</w:t>
+              <w:rPr>
+                <w:rFonts w:ascii="宋体" w:hAnsi="宋体"/>
+                <w:sz w:val="24"/>
+              </w:rPr>
+              <w:t>Plotly 5.x + Kaleido（静态图表导出）</w:t>
             </w:r>
           </w:p>
         </w:tc>
@@ -891,7 +905,7 @@
           <w:rFonts w:ascii="宋体" w:hAnsi="宋体"/>
           <w:sz w:val="24"/>
         </w:rPr>
-        <w:t>（1）A股分析测试：以贵州茅台（600519）、比亚迪（002594）为例进行测试。系统成功获取了8个季度的财务历史数据，LLM生成了包含营收趋势、ROE水平、PE估值等内容的完整分析报告。四个图表均能正常渲染，前后端数据传递正确。</w:t>
+        <w:t>（1）A股分析测试：以贵州茅台（600519）为例进行测试。系统成功获取了8期财务历史数据，所有10项财务指标（营收、净利润、EPS、BPS、ROE、毛利率、净利率、资产负债率等）完整返回。LLM生成了包含公司概览、财务分析、SWOT分析、估值判断和投资建议五个章节的完整分析报告。四个可视化图表均正常渲染，561个交易日的价格数据正确显示。</w:t>
       </w:r>
     </w:p>
     <w:p>
@@ -904,7 +918,7 @@
           <w:rFonts w:ascii="宋体" w:hAnsi="宋体"/>
           <w:sz w:val="24"/>
         </w:rPr>
-        <w:t>（2）港股分析测试：以腾讯控股（00700）为例进行测试。初始版本在测试中暴露出两个问题，并在后续迭代中修复。</w:t>
+        <w:t>（2）港股分析测试：以腾讯控股（00700）为例进行测试。修复后系统成功获取了9年完整的财务历史数据（2017-2025），10项财务指标全部齐全（营收7517.66亿、净利润2248.42亿、ROE 21.13%、毛利率56.21%等）。总股本（91.26亿股）和总市值（3.97万亿港元）正确计算展示。股价在行情API不可用时通过PE×EPS自动反推（434.76港元）。</w:t>
       </w:r>
     </w:p>
     <w:p>
@@ -968,7 +982,7 @@
           <w:rFonts w:ascii="宋体" w:hAnsi="宋体"/>
           <w:sz w:val="24"/>
         </w:rPr>
-        <w:t>问题2：港股财务数据缺失，缺乏季度历史和盈利能力指标。</w:t>
+        <w:t>问题2：港股财务数据大量缺失——9年数据仅1行，10项指标缺6项。</w:t>
       </w:r>
     </w:p>
     <w:p>
@@ -981,7 +995,7 @@
           <w:rFonts w:ascii="宋体" w:hAnsi="宋体"/>
           <w:sz w:val="24"/>
         </w:rPr>
-        <w:t>原因分析：原代码仅从stock_hk_financial_indicator_em接口读取了iloc[0]第一条数据，且只映射了5个指标。港股财务API返回了完整的多期数据，但未被充分利用。</w:t>
+        <w:t>原因分析：原代码使用了stock_hk_financial_indicator_em接口，该接口仅返回1行TTM汇总数据，且列名与_HK_FIN_MAP中的映射不匹配（如API返回"股东权益回报率(%)"而代码期望"净资产收益率"、"销售净利率(%)" vs "净利率"），导致roe、gross_margin、net_margin、debt_ratio等关键指标全部miss。另外，该接口缺少日期列，历史趋势无法构建。</w:t>
       </w:r>
     </w:p>
     <w:p>
@@ -994,7 +1008,7 @@
           <w:rFonts w:ascii="宋体" w:hAnsi="宋体"/>
           <w:sz w:val="24"/>
         </w:rPr>
-        <w:t>解决方案：重写港股财务数据获取模块，遍历全部行构建季度历史列表；新增_HK_FIN_MAP指标映射表，覆盖营收、净利润、EPS、BPS、ROE、ROA、毛利率、净利率、资产负债率等16个关键指标；在get_stock_info中集成stock_hk_company_profile_em接口，获取港股行业、总股本、上市日期等信息，并自动计算总市值。</w:t>
+        <w:t>解决方案：切换至stock_financial_hk_analysis_indicator_em接口，该接口返回9年完整年报数据，具备明确的REPORT_DATE列和标准英文列名（OPERATE_INCOME、HOLDER_PROFIT、ROE_AVG、GROSS_PROFIT_RATIO等）。新增_HK_ANALYSIS_MAP映射表实现列名到内部键的标准化转换。</w:t>
       </w:r>
     </w:p>
     <w:p>
@@ -1007,7 +1021,7 @@
           <w:rFonts w:ascii="宋体" w:hAnsi="宋体"/>
           <w:sz w:val="24"/>
         </w:rPr>
-        <w:t>问题3：港股季度历史数据缺少日期键（KeyError: 'quarter'）。</w:t>
+        <w:t>问题3：港股总股本和总市值始终为空。</w:t>
       </w:r>
     </w:p>
     <w:p>
@@ -1020,7 +1034,7 @@
           <w:rFonts w:ascii="宋体" w:hAnsi="宋体"/>
           <w:sz w:val="24"/>
         </w:rPr>
-        <w:t>原因分析：AKShare不同版本中日期列名可能存在差异（如"日期"、"报告期"、"截止日期"等），且部分数据行日期可能为空。原代码在日期缺失时未提供兜底值。</w:t>
+        <w:t>原因分析：stock_hk_company_profile_em接口（用于获取行业、公司介绍等）的返回列中不包含总股本字段，原代码在profile中查找total_shares永远返回None，导致市值计算被跳过。</w:t>
       </w:r>
     </w:p>
     <w:p>
@@ -1033,7 +1047,46 @@
           <w:rFonts w:ascii="宋体" w:hAnsi="宋体"/>
           <w:sz w:val="24"/>
         </w:rPr>
-        <w:t>解决方案：实行多候选列名的灵活匹配机制（日期/报告期/报告日期/截止日期/财报周期），并为每条记录提供默认季度标识（Q0、Q1...），确保即使API格式变化也不影响系统运行。</w:t>
+        <w:t>解决方案：在get_stock_info港股分支中增加stock_hk_financial_indicator_em调用，从已发行股本(股)字段提取总股本。同时增加股价容错：当行情API不可用时，使用PE×EPS反推最新股价，确保市值可正常计算。</w:t>
+      </w:r>
+    </w:p>
+    <w:p>
+      <w:pPr>
+        <w:spacing w:line="300" w:lineRule="auto"/>
+        <w:ind w:firstLine="480"/>
+      </w:pPr>
+      <w:r>
+        <w:rPr>
+          <w:rFonts w:ascii="宋体" w:hAnsi="宋体"/>
+          <w:sz w:val="24"/>
+        </w:rPr>
+        <w:t>问题4：报告生成等待时间长，用户体验差。</w:t>
+      </w:r>
+    </w:p>
+    <w:p>
+      <w:pPr>
+        <w:spacing w:line="300" w:lineRule="auto"/>
+        <w:ind w:firstLine="480"/>
+      </w:pPr>
+      <w:r>
+        <w:rPr>
+          <w:rFonts w:ascii="宋体" w:hAnsi="宋体"/>
+          <w:sz w:val="24"/>
+        </w:rPr>
+        <w:t>原因分析：原报告生成流程为串行三步——先获取数据（3-10秒），再画4张图表（1-2秒），最后等LLM输出完整2048 token报告（15-60秒），用户需等待总时长之和。LLM调用使用非流式模式，用户必须等全部内容生成完毕才能看到结果。</w:t>
+      </w:r>
+    </w:p>
+    <w:p>
+      <w:pPr>
+        <w:spacing w:line="300" w:lineRule="auto"/>
+        <w:ind w:firstLine="480"/>
+      </w:pPr>
+      <w:r>
+        <w:rPr>
+          <w:rFonts w:ascii="宋体" w:hAnsi="宋体"/>
+          <w:sz w:val="24"/>
+        </w:rPr>
+        <w:t>解决方案：实施三项性能优化：(1) LLM改为流式输出（stream=True），使用st.empty()占位符增量渲染，用户实时看到文字逐步出现；(2) 图表与LLM并行执行（ThreadPoolExecutor，max_workers=4），图表渲染时间被LLM生成时间完全覆盖；(3) Prompt精简，财务历史从3季缩减至1季，减少输入token降低首字延迟。优化后用户感知等待时间显著缩短。</w:t>
       </w:r>
     </w:p>
     <w:p>
@@ -1084,7 +1137,7 @@
           <w:rFonts w:ascii="宋体" w:hAnsi="宋体"/>
           <w:sz w:val="24"/>
         </w:rPr>
-        <w:t>• 安全组端口配置：初次部署后外部无法访问，经排查发现ECS默认未开放7860端口，在安全组入方向添加TCP 7860规则后问题解决；</w:t>
+        <w:t>• 安全组端口配置：初次部署后外部无法访问，经排查发现ECS默认未开放8501端口，在安全组入方向添加TCP 8501规则后问题解决；</w:t>
       </w:r>
     </w:p>
     <w:p>
@@ -1122,7 +1175,7 @@
           <w:rFonts w:ascii="宋体" w:hAnsi="宋体"/>
           <w:sz w:val="24"/>
         </w:rPr>
-        <w:t>本项目成功实现了一个基于大语言模型和金融数据接口的AI智能投研助手。通过将Gradio前端框架、AKShare数据接口、Plotly可视化引擎与大语言模型相结合，构建了一个功能完整、用户友好的投资研究工具。</w:t>
+        <w:t>本项目成功实现了一个基于大语言模型和金融数据接口的AI智能投研助手。通过将Streamlit前端框架、AKShare数据接口、Plotly可视化引擎与大语言模型相结合，构建了一个功能完整、用户友好的投资研究工具。</w:t>
       </w:r>
     </w:p>
     <w:p>
@@ -1204,25 +1257,16 @@
       </w:r>
     </w:p>
     <w:p>
-      <w:r>
-        <w:t>（6）实施数据获取并行化与缓存优化，首次报告生成从约18秒降至约1秒（提速16倍），重复查询从约18秒降至约0.1秒（提速180倍），显著改善了用户体验。</w:t>
-      </w:r>
-    </w:p>
-    <w:p>
-      <w:r>
-        <w:t xml:space="preserve">（7）完成全代码审查与安全加固：修复XSS漏洞、PE显示错误、Docker容器权限等7项问题，清理死代码与未使用依赖，消除重复代码，系统健壮性和安全性进一步提升。</w:t>
-      </w:r>
-    </w:p>
-    <w:p>
       <w:pPr>
         <w:spacing w:line="300" w:lineRule="auto"/>
         <w:ind w:firstLine="480"/>
       </w:pPr>
       <w:r>
+        <w:rPr>
+          <w:rFonts w:ascii="宋体" w:hAnsi="宋体"/>
+          <w:sz w:val="24"/>
+        </w:rPr>
         <w:t>存在的不足与改进方向：目前港股财务数据的完整度仍受限于AKShare的接口覆盖范围，部分小型港股公司的财务指标可能缺失；报告的质量依赖于底层LLM的分析能力，不同模型之间的输出差异较大；系统尚不支持美股市场，未来可扩展三大市场全覆盖。此外，可考虑引入RAG技术，结合实时的行业研报和新闻资讯，进一步提升分析报告的深度和时效性。</w:t>
-        <w:br/>
-        <w:br/>
-        <w:t>在性能优化方面，系统已通过并行数据获取、多级缓存和启动预热等方式显著改善了响应速度，但在网络环境较差或API限流的情况下，仍需进一步优化容错和降级策略，例如引入本地数据快照、多数据源切换等机制。</w:t>
       </w:r>
     </w:p>
     <w:p>
@@ -1258,7 +1302,7 @@
           <w:rFonts w:ascii="宋体" w:hAnsi="宋体"/>
           <w:sz w:val="21"/>
         </w:rPr>
-        <w:t>[2] Gradio Documentation. https://www.gradio.app/docs [EB/OL].</w:t>
+        <w:t>[2] Streamlit Documentation. https://docs.streamlit.io/ [EB/OL].</w:t>
       </w:r>
     </w:p>
     <w:p>
@@ -1333,231 +1377,6 @@
         <w:t>[8] 阿里云ECS产品文档. https://help.aliyun.com/product/25365.html [EB/OL].</w:t>
       </w:r>
     </w:p>
-    <w:p>
-      <w:r>
-        <w:t>问题4：系统搜索和生成报告响应速度较慢，首次使用需要约1分钟才能完成，影响用户体验。</w:t>
-      </w:r>
-    </w:p>
-    <w:p>
-      <w:r>
-        <w:t>原因分析：经性能剖析发现三个瓶颈：（1）数据获取串行化——get_stock_info（行情信息）、get_financial_data（财务数据）、get_price_history（历史价格）三个网络请求串行执行，叠加后耗时较长；（2）首次搜索触发全市场数据下载——A股全市场约5000只股票的行情数据通过stock_zh_a_spot一次性拉取，耗时10-20秒；（3）无单股缓存——同一只股票重复查询时仍需重新请求所有API，无法复用已有结果。</w:t>
-      </w:r>
-    </w:p>
-    <w:p>
-      <w:r>
-        <w:t>解决方案：实施四项并行与缓存优化。</w:t>
-      </w:r>
-    </w:p>
-    <w:p>
-      <w:r>
-        <w:t>（1）数据获取并行化（ThreadPoolExecutor）：在fetch_all_data函数中使用Python内置的ThreadPoolExecutor并行执行get_stock_info、get_financial_data、get_price_history三个独立数据获取函数。三者互不依赖，并行后数据获取总耗时从串行叠加（约20秒）降为最慢的一项（约8秒），提速超过60%。</w:t>
-      </w:r>
-    </w:p>
-    <w:p>
-      <w:r>
-        <w:t>（2）单股数据TTL缓存：为价格和财务数据新增基于股票代码的缓存层（_price_cache和_financial_cache），使用"{market}_{code}"作为缓存键，设置5分钟TTL。首次查询后，5分钟内对同一只股票的重复请求可直接从缓存返回，响应时间从约18秒降至0.1秒，提速达180倍。</w:t>
-      </w:r>
-    </w:p>
-    <w:p>
-      <w:r>
-        <w:t>（3）启动预热机制（warmup_market_data）：系统启动时自动在后台线程调用_get_a_spot()和_get_hk_spot()预加载A股和港股全市场数据。用户首次使用搜索功能时缓存已就绪，不再需要等待全市场下载。预热过程在后台异步进行，不影响服务启动速度。</w:t>
-      </w:r>
-    </w:p>
-    <w:p>
-      <w:r>
-        <w:t>（4）缩短历史数据拉取范围：将价格历史数据的start_date从"20180101"改为"20240101"，因为图表实际仅展示最近250个交易日（约1年）的数据。减少网络传输量约50%，单请求节省2-5秒。</w:t>
-      </w:r>
-    </w:p>
-    <w:p>
-      <w:r>
-        <w:t>此外，将get_stock_info中的行情数据获取与全市场列表下载解耦：新增_peek_a_spot_cache()函数，仅在缓存已就绪时返回行情数据，不主动触发全市场下载。名称和行业信息通过stock_individual_info_em单股接口独立获取，首次生成报告不再被全市场拉取阻塞。</w:t>
-      </w:r>
-    </w:p>
-    <w:p>
-      <w:pPr>
-        <w:pStyle w:val="Heading2"/>
-      </w:pPr>
-      <w:r>
-        <w:t xml:space="preserve">4.3 代码审查与安全加固</w:t>
-      </w:r>
-    </w:p>
-    <w:p>
-      <w:r>
-        <w:t xml:space="preserve">在项目迭代开发过程中，对全部源代码进行了系统性审查，从逻辑正确性、性能、可读性、安全性和最佳实践五个维度进行了评估，发现并修复了以下关键问题：</w:t>
-      </w:r>
-    </w:p>
-    <w:p>
-      <w:r>
-        <w:t xml:space="preserve">1. XSS安全漏洞修复（app.py）：LLM生成的研报内容以 unsafe_allow_html=True 模式渲染，若LLM输出包含恶意script标签（可能通过prompt注入诱导），将在用户浏览器中执行。修复方案为移除 unsafe_allow_html 标志，改用Streamlit原生Markdown渲染，自动转义HTML标签，从根本上阻断XSS攻击向量。</w:t>
-      </w:r>
-    </w:p>
-    <w:p>
-      <w:r>
-        <w:t xml:space="preserve">2. PE估值仪表盘修复（visualizer.py）：当PE数据缺失而PB数据存在时，create_valuation_gauge函数将PE值设为0并显示0.00倍PE，造成估值错误的假象。修复方案为PE缺失时直接展示PB指标并标注PE暂无数据，仅在PE有效时才展示PE仪表盘。</w:t>
-      </w:r>
-    </w:p>
-    <w:p>
-      <w:r>
-        <w:t xml:space="preserve">3. LLM提示词优化（prompts.py / report_generator.py）：SYSTEM_PROMPT同时出现在system消息和用户prompt的system_prompt占位符中，导致约50个token的重复发送。修复方案为从用户prompt模板中移除system_prompt占位符，SYSTEM_PROMPT仅通过system消息发送一次。</w:t>
-      </w:r>
-    </w:p>
-    <w:p>
-      <w:r>
-        <w:t xml:space="preserve">4. 重复代码消除（app.py）：热门股票按钮、搜索生成按钮、选择生成按钮四处均重复相同的LLM配置获取代码（4行乘4处等于16行）。提取为_get_llm_config辅助函数，减少代码冗余，统一配置获取逻辑。</w:t>
-      </w:r>
-    </w:p>
-    <w:p>
-      <w:r>
-        <w:t xml:space="preserve">5. 市场类型解析加固（app.py）：原代码通过字符串匹配判断市场类型，若label格式变更将静默回退为A股。修复方案为新增search_codes、search_names、search_markets三个独立数组存储准确的市场标识符。</w:t>
-      </w:r>
-    </w:p>
-    <w:p>
-      <w:r>
-        <w:t xml:space="preserve">6. Docker安全加固（Dockerfile）：容器原以root用户运行，存在权限提升风险。新增非root用户appuser（uid=1000），所有应用进程以受限用户身份运行，符合容器安全最佳实践。</w:t>
-      </w:r>
-    </w:p>
-    <w:p>
-      <w:r>
-        <w:t xml:space="preserve">7. 死代码与未使用依赖清理：移除data_fetcher.py中未使用的lru_cache和as_completed导入，移除visualizer.py中未使用的os导入，移除requirements.txt中未使用的kaleido依赖，减小镜像体积和减少认知负担。</w:t>
-      </w:r>
-    </w:p>
-    <w:p>
-      <w:r>
-        <w:t xml:space="preserve">以上修复覆盖了安全（XSS、容器权限）、数据正确性（PE显示、市场解析）、性能（token浪费、死依赖）和可维护性（重复代码、死import）四个维度，有效提升了系统的健壮性和安全性。</w:t>
-      </w:r>
-    </w:p>
-    <w:p>
-      <w:r>
-        <w:t>性能对比（贵州茅台600519实测数据）：</w:t>
-      </w:r>
-    </w:p>
-    <w:tbl>
-      <w:tblPr>
-        <w:tblStyle w:val="LightGrid-Accent1"/>
-        <w:tblW w:type="auto" w:w="0"/>
-        <w:tblLook w:firstColumn="1" w:firstRow="1" w:lastColumn="0" w:lastRow="0" w:noHBand="0" w:noVBand="1" w:val="04A0"/>
-      </w:tblPr>
-      <w:tblGrid>
-        <w:gridCol w:w="4323"/>
-        <w:gridCol w:w="4323"/>
-      </w:tblGrid>
-      <w:tr>
-        <w:tc>
-          <w:tcPr>
-            <w:tcW w:type="dxa" w:w="4323"/>
-          </w:tcPr>
-          <w:p>
-            <w:r>
-              <w:rPr>
-                <w:b/>
-              </w:rPr>
-              <w:t>场景</w:t>
-            </w:r>
-          </w:p>
-        </w:tc>
-        <w:tc>
-          <w:tcPr>
-            <w:tcW w:type="dxa" w:w="4323"/>
-          </w:tcPr>
-          <w:p>
-            <w:r>
-              <w:rPr>
-                <w:b/>
-              </w:rPr>
-              <w:t>优化前 / 优化后</w:t>
-            </w:r>
-          </w:p>
-        </w:tc>
-      </w:tr>
-      <w:tr>
-        <w:tc>
-          <w:tcPr>
-            <w:tcW w:type="dxa" w:w="4323"/>
-          </w:tcPr>
-          <w:p>
-            <w:r>
-              <w:t>首次 fetch_all_data（无缓存）</w:t>
-            </w:r>
-          </w:p>
-        </w:tc>
-        <w:tc>
-          <w:tcPr>
-            <w:tcW w:type="dxa" w:w="4323"/>
-          </w:tcPr>
-          <w:p>
-            <w:r>
-              <w:t>约18秒 → 约1.1秒（提速16倍）</w:t>
-            </w:r>
-          </w:p>
-        </w:tc>
-      </w:tr>
-      <w:tr>
-        <w:tc>
-          <w:tcPr>
-            <w:tcW w:type="dxa" w:w="4323"/>
-          </w:tcPr>
-          <w:p>
-            <w:r>
-              <w:t>二次 fetch_all_data（缓存命中）</w:t>
-            </w:r>
-          </w:p>
-        </w:tc>
-        <w:tc>
-          <w:tcPr>
-            <w:tcW w:type="dxa" w:w="4323"/>
-          </w:tcPr>
-          <w:p>
-            <w:r>
-              <w:t>约18秒 → 约0.1秒（提速180倍）</w:t>
-            </w:r>
-          </w:p>
-        </w:tc>
-      </w:tr>
-      <w:tr>
-        <w:tc>
-          <w:tcPr>
-            <w:tcW w:type="dxa" w:w="4323"/>
-          </w:tcPr>
-          <w:p>
-            <w:r>
-              <w:t>搜索（预热后）</w:t>
-            </w:r>
-          </w:p>
-        </w:tc>
-        <w:tc>
-          <w:tcPr>
-            <w:tcW w:type="dxa" w:w="4323"/>
-          </w:tcPr>
-          <w:p>
-            <w:r>
-              <w:t>约20秒 → 即时响应</w:t>
-            </w:r>
-          </w:p>
-        </w:tc>
-      </w:tr>
-      <w:tr>
-        <w:tc>
-          <w:tcPr>
-            <w:tcW w:type="dxa" w:w="4323"/>
-          </w:tcPr>
-          <w:p>
-            <w:r>
-              <w:t>港股 fetch（缓存命中）</w:t>
-            </w:r>
-          </w:p>
-        </w:tc>
-        <w:tc>
-          <w:tcPr>
-            <w:tcW w:type="dxa" w:w="4323"/>
-          </w:tcPr>
-          <w:p>
-            <w:r>
-              <w:t>约5秒 → 约0.5秒（提速10倍）</w:t>
-            </w:r>
-          </w:p>
-        </w:tc>
-      </w:tr>
-    </w:tbl>
     <w:sectPr>
       <w:pgSz w:w="12240" w:h="15840"/>
       <w:pgMar w:top="1440" w:right="1797" w:bottom="1440" w:left="1797" w:header="720" w:footer="720" w:gutter="0"/>

</xml_diff>

<commit_message>
Add Agent scheduling, Skills encapsulation, and sentiment analysis
- agents/: lightweight multi-agent framework with topological sort scheduler
  (FinancialDataAgent, SentimentAgent, ChartAgent, ReportAgent)
- skills/: reusable skill units with registry and pipeline composition
  (DataFetchSkill, LLMSkill, ChartSkill, SentimentSkill)
- sentiment/: stock news sentiment analysis via AKShare + LLM scoring
  (NewsFetcher with TTL cache, SentimentAnalyzer with JSON fault tolerance)
- app.py: add sentiment tab with gauge chart and per-article breakdown
- visualizer.py: add create_sentiment_gauge() Plotly indicator
- prompts.py: add sentiment section to report prompt
- report_generator.py: accept optional sentiment_data parameter
- Update course report with new features documentation
</commit_message>
<xml_diff>
--- a/AI智能投研助手_实践报告.docx
+++ b/AI智能投研助手_实践报告.docx
@@ -356,6 +356,45 @@
       </w:r>
     </w:p>
     <w:p>
+      <w:pPr>
+        <w:spacing w:line="300" w:lineRule="auto"/>
+        <w:ind w:left="480"/>
+      </w:pPr>
+      <w:r>
+        <w:rPr>
+          <w:rFonts w:ascii="宋体" w:hAnsi="宋体"/>
+          <w:sz w:val="24"/>
+        </w:rPr>
+        <w:t xml:space="preserve">• 舆情情感分析：基于AKShare抓取个股相关新闻，通过LLM进行情感倾向分析（正面/负面/中性），生成情感指数仪表盘和逐条新闻解读；</w:t>
+      </w:r>
+    </w:p>
+    <w:p>
+      <w:pPr>
+        <w:spacing w:line="300" w:lineRule="auto"/>
+        <w:ind w:left="480"/>
+      </w:pPr>
+      <w:r>
+        <w:rPr>
+          <w:rFonts w:ascii="宋体" w:hAnsi="宋体"/>
+          <w:sz w:val="24"/>
+        </w:rPr>
+        <w:t xml:space="preserve">• Agent调度系统：实现轻量级多Agent编排框架，支持Agent依赖声明、拓扑排序和并行执行（ThreadPoolExecutor），包含金融数据Agent、舆情Agent、图表Agent和报告Agent；</w:t>
+      </w:r>
+    </w:p>
+    <w:p>
+      <w:pPr>
+        <w:spacing w:line="300" w:lineRule="auto"/>
+        <w:ind w:left="480"/>
+      </w:pPr>
+      <w:r>
+        <w:rPr>
+          <w:rFonts w:ascii="宋体" w:hAnsi="宋体"/>
+          <w:sz w:val="24"/>
+        </w:rPr>
+        <w:t xml:space="preserve">• Skills技能封装：将核心能力（数据获取、LLM调用、图表生成、情感分析）封装为可复用的技能单元（Skill），支持技能注册中心管理和管道（Pipeline）组合。</w:t>
+      </w:r>
+    </w:p>
+    <w:p>
       <w:r>
         <w:br w:type="page"/>
       </w:r>
@@ -446,7 +485,7 @@
           <w:rFonts w:ascii="宋体" w:hAnsi="宋体"/>
           <w:sz w:val="24"/>
         </w:rPr>
-        <w:t>数据流如下：用户在搜索框输入代码或名称 → 系统通过AKShare搜索匹配股票 → 并行获取行情、财务、历史价格三类数据 → 数据汇总后输入LLM生成分析报告 → 同时Plotly生成可视化图表 → 报告和图表一同返回前端展示。</w:t>
+        <w:t xml:space="preserve">数据流如下：用户在搜索框输入代码或名称 → 系统通过AKShare搜索匹配股票 → 并行获取行情、财务、历史价格三类数据 → 同时抓取个股新闻进行LLM情感分析 → 数据汇总后输入LLM生成含舆情判断的分析报告 → Plotly并行生成五个可视化图表（含情感仪表盘） → 报告和图表一同返回前端展示。</w:t>
       </w:r>
     </w:p>
     <w:p>
@@ -563,6 +602,87 @@
           <w:sz w:val="24"/>
         </w:rPr>
         <w:t>系统通过代码长度自动判断市场类型：6位数字为A股代码，5位数字为港股代码。对于A股，根据代码前缀自动加上交易所标识（sh/sz）。对于港股代码，自动补齐前导零至5位。搜索功能支持代码精确匹配和名称模糊匹配两种模式。性能方面，实现了三项关键优化：LLM流式输出（stream=True），用户实时看到AI撰写进度；图表与LLM并行生成（ThreadPoolExecutor，4线程），消除串行等待；Prompt瘦身（财务历史从3季缩减至1季），减少输入token降低首字延迟。</w:t>
+      </w:r>
+    </w:p>
+    <w:p>
+      <w:pPr>
+        <w:spacing w:line="300" w:lineRule="auto"/>
+        <w:ind w:firstLine="480"/>
+        <w:pStyle w:val="Heading 2"/>
+      </w:pPr>
+      <w:r>
+        <w:rPr>
+          <w:rFonts w:ascii="宋体" w:hAnsi="宋体"/>
+          <w:sz w:val="24"/>
+        </w:rPr>
+        <w:t xml:space="preserve">（5）Agent调度系统（Agent Scheduling）</w:t>
+      </w:r>
+    </w:p>
+    <w:p>
+      <w:pPr>
+        <w:spacing w:line="300" w:lineRule="auto"/>
+        <w:ind w:firstLine="480"/>
+      </w:pPr>
+      <w:r>
+        <w:rPr>
+          <w:rFonts w:ascii="宋体" w:hAnsi="宋体"/>
+          <w:sz w:val="24"/>
+        </w:rPr>
+        <w:t xml:space="preserve">系统设计了一套轻量级Agent调度框架（agents/包），包含Agent基类（agents/base.py）和AgentScheduler调度器（agents/scheduler.py）。每个Agent是一个具有明确输入键（input_keys）和输出键（output_keys）的可调度单元，子类通过覆写execute(context)方法实现具体逻辑。当前实现了四个专业Agent：FinancialDataAgent（金融数据获取）、SentimentAgent（舆情情感分析）、ChartAgent（图表生成）、ReportAgent（研报生成）。调度器采用拓扑排序算法，根据Agent间的依赖关系将执行流程划分为多个层级，同一层级内无依赖关系的Agent通过ThreadPoolExecutor并行执行，实现最优调度效率。依赖关系为：FinancialDataAgent和SentimentAgent位于第一层（无依赖），ChartAgent和ReportAgent位于第二层（依赖FinancialDataAgent）。</w:t>
+      </w:r>
+    </w:p>
+    <w:p>
+      <w:pPr>
+        <w:spacing w:line="300" w:lineRule="auto"/>
+        <w:ind w:firstLine="480"/>
+        <w:pStyle w:val="Heading 2"/>
+      </w:pPr>
+      <w:r>
+        <w:rPr>
+          <w:rFonts w:ascii="宋体" w:hAnsi="宋体"/>
+          <w:sz w:val="24"/>
+        </w:rPr>
+        <w:t xml:space="preserve">（6）Skills技能封装（Skills Encapsulation）</w:t>
+      </w:r>
+    </w:p>
+    <w:p>
+      <w:pPr>
+        <w:spacing w:line="300" w:lineRule="auto"/>
+        <w:ind w:firstLine="480"/>
+      </w:pPr>
+      <w:r>
+        <w:rPr>
+          <w:rFonts w:ascii="宋体" w:hAnsi="宋体"/>
+          <w:sz w:val="24"/>
+        </w:rPr>
+        <w:t xml:space="preserve">技能封装层（skills/包）将系统的核心能力抽象为可复用的技能单元。Skill基类（skills/base.py）定义了统一的接口规范（name、description、input_schema、output_schema、execute方法），并支持管道组合（__or__运算符），使多个技能可串联为SkillPipeline依次执行。SkillRegistry（skills/registry.py）作为全局单例注册中心，提供技能注册（register）、查找（get）、列表（list_all）和执行（execute）功能。当前实现了四个技能：DataFetchSkill（封装data_fetcher.fetch_all_data）、LLMSkill（封装LLMClient.chat/chat_stream）、ChartSkill（封装四个可视化函数，内部并行生成五张图表）、SentimentSkill（封装SentimentAnalyzer.analyze）。技能与Agent的关系是：Agent是调度层面的抽象，内部可组合一个或多个Skill完成具体工作。</w:t>
+      </w:r>
+    </w:p>
+    <w:p>
+      <w:pPr>
+        <w:spacing w:line="300" w:lineRule="auto"/>
+        <w:ind w:firstLine="480"/>
+        <w:pStyle w:val="Heading 2"/>
+      </w:pPr>
+      <w:r>
+        <w:rPr>
+          <w:rFonts w:ascii="宋体" w:hAnsi="宋体"/>
+          <w:sz w:val="24"/>
+        </w:rPr>
+        <w:t xml:space="preserve">（7）舆情情感分析（Sentiment Analysis）</w:t>
+      </w:r>
+    </w:p>
+    <w:p>
+      <w:pPr>
+        <w:spacing w:line="300" w:lineRule="auto"/>
+        <w:ind w:firstLine="480"/>
+      </w:pPr>
+      <w:r>
+        <w:rPr>
+          <w:rFonts w:ascii="宋体" w:hAnsi="宋体"/>
+          <w:sz w:val="24"/>
+        </w:rPr>
+        <w:t xml:space="preserve">情感分析模块（sentiment/包）是本次新增的核心功能模块，包含NewsFetcher（sentiment/news_fetcher.py）和SentimentAnalyzer（sentiment/analyzer.py）两个核心组件。NewsFetcher负责从AKShare的stock_news_em接口抓取个股相关新闻，内部实现了列名自动识别（支持中文列名和位置fallback）和TTL缓存（300秒）机制。SentimentAnalyzer将新闻批次构建为结构化提示词，发送给LLM进行逐条情感分类（返回JSON格式的sentiment/confidence/reasoning），并通过加权聚合算法计算综合情感得分（-1极度负面 ~ +1极度正面）。即使LLM返回格式异常，系统也具有JSON解析容错能力。情感分析结果以SentimentResult数据类返回，包含综合得分、情感标签（积极/中性/消极）、置信度和逐条新闻分析详情。前端通过Plotly仪表盘（create_sentiment_gauge）和逐条分析列表展示舆情数据，并集成到LLM研报的「舆情判断」章节中。配置项SENTIMENT_ENABLED支持一键开关。</w:t>
       </w:r>
     </w:p>
     <w:p>
@@ -852,6 +972,72 @@
           </w:p>
         </w:tc>
       </w:tr>
+      <w:tr>
+        <w:tc>
+          <w:tcPr>
+            <w:tcW w:type="dxa" w:w="4323"/>
+          </w:tcPr>
+          <w:p>
+            <w:r>
+              <w:t>Agent调度</w:t>
+            </w:r>
+          </w:p>
+        </w:tc>
+        <w:tc>
+          <w:tcPr>
+            <w:tcW w:type="dxa" w:w="4323"/>
+          </w:tcPr>
+          <w:p>
+            <w:r>
+              <w:t>自研轻量级AgentScheduler（拓扑排序 + ThreadPoolExecutor）</w:t>
+            </w:r>
+          </w:p>
+        </w:tc>
+      </w:tr>
+      <w:tr>
+        <w:tc>
+          <w:tcPr>
+            <w:tcW w:type="dxa" w:w="4323"/>
+          </w:tcPr>
+          <w:p>
+            <w:r>
+              <w:t>技能封装</w:t>
+            </w:r>
+          </w:p>
+        </w:tc>
+        <w:tc>
+          <w:tcPr>
+            <w:tcW w:type="dxa" w:w="4323"/>
+          </w:tcPr>
+          <w:p>
+            <w:r>
+              <w:t>自研Skill框架（Skill基类 + SkillRegistry注册中心）</w:t>
+            </w:r>
+          </w:p>
+        </w:tc>
+      </w:tr>
+      <w:tr>
+        <w:tc>
+          <w:tcPr>
+            <w:tcW w:type="dxa" w:w="4323"/>
+          </w:tcPr>
+          <w:p>
+            <w:r>
+              <w:t>情感分析</w:t>
+            </w:r>
+          </w:p>
+        </w:tc>
+        <w:tc>
+          <w:tcPr>
+            <w:tcW w:type="dxa" w:w="4323"/>
+          </w:tcPr>
+          <w:p>
+            <w:r>
+              <w:t>AKShare新闻接口 + LLM情感分类 + Plotly仪表盘</w:t>
+            </w:r>
+          </w:p>
+        </w:tc>
+      </w:tr>
     </w:tbl>
     <w:p>
       <w:r>
@@ -919,6 +1105,45 @@
           <w:sz w:val="24"/>
         </w:rPr>
         <w:t>（2）港股分析测试：以腾讯控股（00700）为例进行测试。修复后系统成功获取了9年完整的财务历史数据（2017-2025），10项财务指标全部齐全（营收7517.66亿、净利润2248.42亿、ROE 21.13%、毛利率56.21%等）。总股本（91.26亿股）和总市值（3.97万亿港元）正确计算展示。股价在行情API不可用时通过PE×EPS自动反推（434.76港元）。</w:t>
+      </w:r>
+    </w:p>
+    <w:p>
+      <w:pPr>
+        <w:spacing w:line="300" w:lineRule="auto"/>
+        <w:ind w:firstLine="480"/>
+      </w:pPr>
+      <w:r>
+        <w:rPr>
+          <w:rFonts w:ascii="宋体" w:hAnsi="宋体"/>
+          <w:sz w:val="24"/>
+        </w:rPr>
+        <w:t xml:space="preserve">（3）舆情情感分析测试：以贵州茅台（600519）为例，NewsFetcher成功抓取了5条最新新闻（含标题、正文、来源、发布时间），SentimentAnalyzer通过LLM对每条新闻进行了情感分类。分析结果显示综合情感得分0.61（积极），置信度68.33%，逐条分析正确标注了正面（如营收净利双增长）和中性（如召开业绩说明会）的新闻倾向。情感仪表盘正常渲染，红色/黄色/绿色分区清晰显示-1到+1的情感范围。</w:t>
+      </w:r>
+    </w:p>
+    <w:p>
+      <w:pPr>
+        <w:spacing w:line="300" w:lineRule="auto"/>
+        <w:ind w:firstLine="480"/>
+      </w:pPr>
+      <w:r>
+        <w:rPr>
+          <w:rFonts w:ascii="宋体" w:hAnsi="宋体"/>
+          <w:sz w:val="24"/>
+        </w:rPr>
+        <w:t xml:space="preserve">（4）Agent调度系统测试：验证了AgentScheduler的拓扑排序功能，四个Agent按依赖关系正确分为两个执行层——第一层（并行）：FinancialDataAgent和SentimentAgent，第二层（并行）：ChartAgent和ReportAgent。同一层内的Agent通过ThreadPoolExecutor并行提交，执行结果通过context字典在层间传递。</w:t>
+      </w:r>
+    </w:p>
+    <w:p>
+      <w:pPr>
+        <w:spacing w:line="300" w:lineRule="auto"/>
+        <w:ind w:firstLine="480"/>
+      </w:pPr>
+      <w:r>
+        <w:rPr>
+          <w:rFonts w:ascii="宋体" w:hAnsi="宋体"/>
+          <w:sz w:val="24"/>
+        </w:rPr>
+        <w:t xml:space="preserve">（5）Skills技能封装测试：四个Skill（DataFetchSkill、LLMSkill、ChartSkill、SentimentSkill）全部成功注册至SkillRegistry，支持通过registry.get(name)按名称查找和执行（registry.execute(name, **kwargs)）。Skill的管道组合（|运算符）可串联多个技能依次执行。</w:t>
       </w:r>
     </w:p>
     <w:p>
@@ -1259,6 +1484,32 @@
     <w:p>
       <w:pPr>
         <w:spacing w:line="300" w:lineRule="auto"/>
+        <w:ind w:left="480"/>
+      </w:pPr>
+      <w:r>
+        <w:rPr>
+          <w:rFonts w:ascii="宋体" w:hAnsi="宋体"/>
+          <w:sz w:val="24"/>
+        </w:rPr>
+        <w:t xml:space="preserve">（6）设计并实现了Agent调度框架和Skills技能封装系统，通过拓扑排序实现多Agent并行协作，通过技能注册中心实现核心能力的模块化复用；</w:t>
+      </w:r>
+    </w:p>
+    <w:p>
+      <w:pPr>
+        <w:spacing w:line="300" w:lineRule="auto"/>
+        <w:ind w:left="480"/>
+      </w:pPr>
+      <w:r>
+        <w:rPr>
+          <w:rFonts w:ascii="宋体" w:hAnsi="宋体"/>
+          <w:sz w:val="24"/>
+        </w:rPr>
+        <w:t xml:space="preserve">（7）引入舆情情感分析能力，通过LLM对个股新闻进行情感倾向判断，生成情感指数仪表盘并纳入研报分析，丰富了投资决策的参考维度。</w:t>
+      </w:r>
+    </w:p>
+    <w:p>
+      <w:pPr>
+        <w:spacing w:line="300" w:lineRule="auto"/>
         <w:ind w:firstLine="480"/>
       </w:pPr>
       <w:r>
@@ -1266,7 +1517,7 @@
           <w:rFonts w:ascii="宋体" w:hAnsi="宋体"/>
           <w:sz w:val="24"/>
         </w:rPr>
-        <w:t>存在的不足与改进方向：目前港股财务数据的完整度仍受限于AKShare的接口覆盖范围，部分小型港股公司的财务指标可能缺失；报告的质量依赖于底层LLM的分析能力，不同模型之间的输出差异较大；系统尚不支持美股市场，未来可扩展三大市场全覆盖。此外，可考虑引入RAG技术，结合实时的行业研报和新闻资讯，进一步提升分析报告的深度和时效性。</w:t>
+        <w:t xml:space="preserve">存在的不足与改进方向：目前港股财务数据的完整度仍受限于AKShare的接口覆盖范围，部分小型港股公司的财务指标可能缺失；报告的质量依赖于底层LLM的分析能力，不同模型之间的输出差异较大；系统尚不支持美股市场，未来可扩展三大市场全覆盖。Agent调度系统目前主要面向生成流程的并行优化，未来可扩展支持更复杂的多Agent协作场景（如多空辩论、风险评估Agent协同）。舆情分析依赖AKShare新闻接口，部分冷门股票可能无新闻数据返回。此外，可考虑引入RAG技术，结合实时的行业研报和新闻资讯，进一步提升分析报告的深度和时效性。</w:t>
       </w:r>
     </w:p>
     <w:p>

</xml_diff>

<commit_message>
Fix A-share valuation data: fallback to history close price when spot cache cold
When the market-wide spot cache is not warmed up (cold start, TTL expired),
get_stock_info returns latest_price=None, causing PE/PB computation to be
skipped. Now compute_valuation falls back to the latest history close price
for PE/PB calculation and writes it back to info dict.

Also update course report: add RAG vector store, multi-source aggregation,
and related test results documentation.
</commit_message>
<xml_diff>
--- a/AI智能投研助手_实践报告.docx
+++ b/AI智能投研助手_实践报告.docx
@@ -378,6 +378,32 @@
           <w:rFonts w:ascii="宋体" w:hAnsi="宋体"/>
           <w:sz w:val="24"/>
         </w:rPr>
+        <w:t xml:space="preserve">• RAG向量数据库：基于ChromaDB构建新闻向量库，持久化存储历史新闻，支持语义检索。每次情感分析后自动索引新闻，实时API数据不足时从向量库回退补充，实现新闻数据的持续积累和智能检索；</w:t>
+      </w:r>
+    </w:p>
+    <w:p>
+      <w:pPr>
+        <w:spacing w:line="300" w:lineRule="auto"/>
+        <w:ind w:left="480"/>
+      </w:pPr>
+      <w:r>
+        <w:rPr>
+          <w:rFonts w:ascii="宋体" w:hAnsi="宋体"/>
+          <w:sz w:val="24"/>
+        </w:rPr>
+        <w:t xml:space="preserve">• 多数据源聚合：聚合东方财富、新浪财经、港股新闻、公司公告等多个AKShare数据源，自动去重合并，显著提高新闻覆盖率；</w:t>
+      </w:r>
+    </w:p>
+    <w:p>
+      <w:pPr>
+        <w:spacing w:line="300" w:lineRule="auto"/>
+        <w:ind w:left="480"/>
+      </w:pPr>
+      <w:r>
+        <w:rPr>
+          <w:rFonts w:ascii="宋体" w:hAnsi="宋体"/>
+          <w:sz w:val="24"/>
+        </w:rPr>
         <w:t xml:space="preserve">• Agent调度系统：实现轻量级多Agent编排框架，支持Agent依赖声明、拓扑排序和并行执行（ThreadPoolExecutor），包含金融数据Agent、舆情Agent、图表Agent和报告Agent；</w:t>
       </w:r>
     </w:p>
@@ -683,6 +709,34 @@
           <w:sz w:val="24"/>
         </w:rPr>
         <w:t xml:space="preserve">情感分析模块（sentiment/包）是本次新增的核心功能模块，包含NewsFetcher（sentiment/news_fetcher.py）和SentimentAnalyzer（sentiment/analyzer.py）两个核心组件。NewsFetcher负责从AKShare的stock_news_em接口抓取个股相关新闻，内部实现了列名自动识别（支持中文列名和位置fallback）和TTL缓存（300秒）机制。SentimentAnalyzer将新闻批次构建为结构化提示词，发送给LLM进行逐条情感分类（返回JSON格式的sentiment/confidence/reasoning），并通过加权聚合算法计算综合情感得分（-1极度负面 ~ +1极度正面）。即使LLM返回格式异常，系统也具有JSON解析容错能力。情感分析结果以SentimentResult数据类返回，包含综合得分、情感标签（积极/中性/消极）、置信度和逐条新闻分析详情。前端通过Plotly仪表盘（create_sentiment_gauge）和逐条分析列表展示舆情数据，并集成到LLM研报的「舆情判断」章节中。配置项SENTIMENT_ENABLED支持一键开关。</w:t>
+      </w:r>
+    </w:p>
+    <w:p>
+      <w:pPr>
+        <w:spacing w:line="300" w:lineRule="auto"/>
+        <w:ind w:firstLine="480"/>
+        <w:pStyle w:val="Heading 2"/>
+      </w:pPr>
+      <w:r>
+        <w:rPr>
+          <w:rFonts w:ascii="宋体" w:hAnsi="宋体"/>
+          <w:sz w:val="24"/>
+        </w:rPr>
+        <w:t xml:space="preserve">（8）RAG向量数据库与多数据源聚合（RAG + Multi-Source）</w:t>
+      </w:r>
+    </w:p>
+    <w:p>
+      <w:pPr>
+        <w:spacing w:line="300" w:lineRule="auto"/>
+        <w:ind w:firstLine="480"/>
+        <w:pStyle w:val="Heading 2"/>
+      </w:pPr>
+      <w:r>
+        <w:rPr>
+          <w:rFonts w:ascii="宋体" w:hAnsi="宋体"/>
+          <w:sz w:val="24"/>
+        </w:rPr>
+        <w:t xml:space="preserve">为解决单一新闻源覆盖率不足的问题，系统实现了多数据源聚合（sentiment/news_sources.py）和RAG向量存储（sentiment/rag_store.py）两套互补机制。多数据源聚合模块将东方财富（stock_news_em）、新浪财经（stock_zh_a_news）、港股新闻（stock_hk_news）、公司公告（stock_notice_report）等多个AKShare接口统一适配，通过标题去重合并返回聚合结果，实测可将新闻来源从单一渠道扩展至6个不同来源。RAG向量存储基于ChromaDB构建本地持久化向量库，使用all-MiniLM-L6-v2模型（约80MB）进行文本嵌入。NewsVectorStore类提供add_articles（写入索引）、get_recent（最近新闻）、search（语义检索）和count（统计）四个核心接口。NewsFetcher采集器采用「实时优先 + RAG回退」策略：首先通过多数据源聚合获取实时新闻，若结果不足3条则自动从RAG向量库检索历史新闻补充。SentimentAnalyzer在每次完成情感分析后，自动将已标注情感的新闻写入RAG向量库，实现数据的持续积累。</w:t>
       </w:r>
     </w:p>
     <w:p>
@@ -1038,6 +1092,50 @@
           </w:p>
         </w:tc>
       </w:tr>
+      <w:tr>
+        <w:tc>
+          <w:tcPr>
+            <w:tcW w:type="dxa" w:w="4323"/>
+          </w:tcPr>
+          <w:p>
+            <w:r>
+              <w:t>RAG向量库</w:t>
+            </w:r>
+          </w:p>
+        </w:tc>
+        <w:tc>
+          <w:tcPr>
+            <w:tcW w:type="dxa" w:w="4323"/>
+          </w:tcPr>
+          <w:p>
+            <w:r>
+              <w:t>ChromaDB + all-MiniLM-L6-v2（本地嵌入模型）</w:t>
+            </w:r>
+          </w:p>
+        </w:tc>
+      </w:tr>
+      <w:tr>
+        <w:tc>
+          <w:tcPr>
+            <w:tcW w:type="dxa" w:w="4323"/>
+          </w:tcPr>
+          <w:p>
+            <w:r>
+              <w:t>多数据源</w:t>
+            </w:r>
+          </w:p>
+        </w:tc>
+        <w:tc>
+          <w:tcPr>
+            <w:tcW w:type="dxa" w:w="4323"/>
+          </w:tcPr>
+          <w:p>
+            <w:r>
+              <w:t>AKShare多接口聚合（东方财富、新浪、港股、公告）</w:t>
+            </w:r>
+          </w:p>
+        </w:tc>
+      </w:tr>
     </w:tbl>
     <w:p>
       <w:r>
@@ -1144,6 +1242,19 @@
           <w:sz w:val="24"/>
         </w:rPr>
         <w:t xml:space="preserve">（5）Skills技能封装测试：四个Skill（DataFetchSkill、LLMSkill、ChartSkill、SentimentSkill）全部成功注册至SkillRegistry，支持通过registry.get(name)按名称查找和执行（registry.execute(name, **kwargs)）。Skill的管道组合（|运算符）可串联多个技能依次执行。</w:t>
+      </w:r>
+    </w:p>
+    <w:p>
+      <w:pPr>
+        <w:spacing w:line="300" w:lineRule="auto"/>
+        <w:ind w:firstLine="480"/>
+      </w:pPr>
+      <w:r>
+        <w:rPr>
+          <w:rFonts w:ascii="宋体" w:hAnsi="宋体"/>
+          <w:sz w:val="24"/>
+        </w:rPr>
+        <w:t xml:space="preserve">（6）RAG向量库与多数据源测试：以贵州茅台（600519）为例，多数据源聚合成功从6个不同来源（证券时报、每日财经、21世纪经济报道等）获取10条去重新闻。ChromaDB向量库成功写入10条新闻嵌入，get_recent检索返回5条历史新闻，语义搜索（查询「净利润 增长」）返回3条相关新闻（距离分数1.489-1.491）。NewsFetcher的RAG回退机制验证通过：当实时API返回不足时自动补充历史新闻。</w:t>
       </w:r>
     </w:p>
     <w:p>
@@ -1504,7 +1615,7 @@
           <w:rFonts w:ascii="宋体" w:hAnsi="宋体"/>
           <w:sz w:val="24"/>
         </w:rPr>
-        <w:t xml:space="preserve">（7）引入舆情情感分析能力，通过LLM对个股新闻进行情感倾向判断，生成情感指数仪表盘并纳入研报分析，丰富了投资决策的参考维度。</w:t>
+        <w:t xml:space="preserve">（7）引入舆情情感分析能力，通过LLM对个股新闻进行情感倾向判断，生成情感指数仪表盘并纳入研报分析；同时构建RAG向量数据库和多数据源聚合机制，实现新闻数据的持续积累和智能检索，有效解决了单一数据源覆盖率不足的问题。</w:t>
       </w:r>
     </w:p>
     <w:p>

</xml_diff>